<commit_message>
Renombrar el programa a Arcano · Generador de versiones públicas
Proyectos, espacios de nombres, ejecutable, instalador, ícono e interfaz pasan
a Arcano; el subtítulo aparece en la ventana, la barra y la bienvenida. Los
trabajos se guardan como .arcano y se siguen leyendo los .testado. Al iniciar
se copian el catálogo y las preferencias de %LOCALAPPDATA%\Testado, y el
instalador quita la versión anterior. Versión 0.2.0.
</commit_message>
<xml_diff>
--- a/muestras/ejemplo-word.docx
+++ b/muestras/ejemplo-word.docx
@@ -7,7 +7,7 @@
       <w:r>
         <w:t>SENTENCIA. En el juicio promovido por |María Guadalupe Torres Ruiz|, con domicilio en calle Juárez 120, colonia Centro, C.P. 06000, teléfono 5512345678. Se resuelve a favor de la actora.</w:t>
       </w:r>
-      <w:ins w:id="1" w:author="Testado" w:date="2026-10-22T21:34:00Z" w16du:dateUtc="2026-10-23T03:34:00Z">
+      <w:ins w:id="1" w:author="Arcano" w:date="2026-10-22T21:34:00Z" w16du:dateUtc="2026-10-23T03:34:00Z">
         <w:r>
           <w:t xml:space="preserve"> Texto agregado con control de cambios.</w:t>
         </w:r>
@@ -34,7 +34,7 @@
 
 <file path=word/comments.xml><?xml version="1.0" encoding="utf-8"?>
 <w:comments xmlns:wpc="http://schemas.microsoft.com/office/word/2010/wordprocessingCanvas" xmlns:cx="http://schemas.microsoft.com/office/drawing/2014/chartex" xmlns:cx1="http://schemas.microsoft.com/office/drawing/2015/9/8/chartex" xmlns:cx2="http://schemas.microsoft.com/office/drawing/2015/10/21/chartex" xmlns:cx3="http://schemas.microsoft.com/office/drawing/2016/5/9/chartex" xmlns:cx4="http://schemas.microsoft.com/office/drawing/2016/5/10/chartex" xmlns:cx5="http://schemas.microsoft.com/office/drawing/2016/5/11/chartex" xmlns:cx6="http://schemas.microsoft.com/office/drawing/2016/5/12/chartex" xmlns:cx7="http://schemas.microsoft.com/office/drawing/2016/5/13/chartex" xmlns:cx8="http://schemas.microsoft.com/office/drawing/2016/5/14/chartex" xmlns:mc="http://schemas.openxmlformats.org/markup-compatibility/2006" xmlns:aink="http://schemas.microsoft.com/office/drawing/2016/ink" xmlns:am3d="http://schemas.microsoft.com/office/drawing/2017/model3d" xmlns:o="urn:schemas-microsoft-com:office:office" xmlns:oel="http://schemas.microsoft.com/office/2019/extlst" xmlns:r="http://schemas.openxmlformats.org/officeDocument/2006/relationships" xmlns:m="http://schemas.openxmlformats.org/officeDocument/2006/math" xmlns:v="urn:schemas-microsoft-com:vml" xmlns:wp14="http://schemas.microsoft.com/office/word/2010/wordprocessingDrawing" xmlns:wp="http://schemas.openxmlformats.org/drawingml/2006/wordprocessingDrawing" xmlns:w10="urn:schemas-microsoft-com:office:word" xmlns:w="http://schemas.openxmlformats.org/wordprocessingml/2006/main" xmlns:w14="http://schemas.microsoft.com/office/word/2010/wordml" xmlns:w15="http://schemas.microsoft.com/office/word/2012/wordml" xmlns:w16cex="http://schemas.microsoft.com/office/word/2018/wordml/cex" xmlns:w16cid="http://schemas.microsoft.com/office/word/2016/wordml/cid" xmlns:w16="http://schemas.microsoft.com/office/word/2018/wordml" xmlns:w16du="http://schemas.microsoft.com/office/word/2023/wordml/word16du" xmlns:w16sdtdh="http://schemas.microsoft.com/office/word/2020/wordml/sdtdatahash" xmlns:w16sdtfl="http://schemas.microsoft.com/office/word/2024/wordml/sdtformatlock" xmlns:w16se="http://schemas.microsoft.com/office/word/2015/wordml/symex" xmlns:wpg="http://schemas.microsoft.com/office/word/2010/wordprocessingGroup" xmlns:wpi="http://schemas.microsoft.com/office/word/2010/wordprocessingInk" xmlns:wne="http://schemas.microsoft.com/office/word/2006/wordml" xmlns:wps="http://schemas.microsoft.com/office/word/2010/wordprocessingShape" mc:Ignorable="w14 w15 w16se w16cid w16 w16cex w16sdtdh w16sdtfl w16du wp14">
-  <w:comment w:id="0" w:author="Testado" w:date="2026-10-22T21:34:00Z" w:initials="T">
+  <w:comment w:id="0" w:author="Arcano" w:date="2026-10-22T21:34:00Z" w:initials="T">
     <w:p>
       <w:pPr>
         <w:pStyle w:val="Textocomentario"/>
@@ -73,8 +73,8 @@
 
 <file path=word/people.xml><?xml version="1.0" encoding="utf-8"?>
 <w15:people xmlns:wpc="http://schemas.microsoft.com/office/word/2010/wordprocessingCanvas" xmlns:cx="http://schemas.microsoft.com/office/drawing/2014/chartex" xmlns:cx1="http://schemas.microsoft.com/office/drawing/2015/9/8/chartex" xmlns:cx2="http://schemas.microsoft.com/office/drawing/2015/10/21/chartex" xmlns:cx3="http://schemas.microsoft.com/office/drawing/2016/5/9/chartex" xmlns:cx4="http://schemas.microsoft.com/office/drawing/2016/5/10/chartex" xmlns:cx5="http://schemas.microsoft.com/office/drawing/2016/5/11/chartex" xmlns:cx6="http://schemas.microsoft.com/office/drawing/2016/5/12/chartex" xmlns:cx7="http://schemas.microsoft.com/office/drawing/2016/5/13/chartex" xmlns:cx8="http://schemas.microsoft.com/office/drawing/2016/5/14/chartex" xmlns:mc="http://schemas.openxmlformats.org/markup-compatibility/2006" xmlns:aink="http://schemas.microsoft.com/office/drawing/2016/ink" xmlns:am3d="http://schemas.microsoft.com/office/drawing/2017/model3d" xmlns:o="urn:schemas-microsoft-com:office:office" xmlns:oel="http://schemas.microsoft.com/office/2019/extlst" xmlns:r="http://schemas.openxmlformats.org/officeDocument/2006/relationships" xmlns:m="http://schemas.openxmlformats.org/officeDocument/2006/math" xmlns:v="urn:schemas-microsoft-com:vml" xmlns:wp14="http://schemas.microsoft.com/office/word/2010/wordprocessingDrawing" xmlns:wp="http://schemas.openxmlformats.org/drawingml/2006/wordprocessingDrawing" xmlns:w10="urn:schemas-microsoft-com:office:word" xmlns:w="http://schemas.openxmlformats.org/wordprocessingml/2006/main" xmlns:w14="http://schemas.microsoft.com/office/word/2010/wordml" xmlns:w15="http://schemas.microsoft.com/office/word/2012/wordml" xmlns:w16cex="http://schemas.microsoft.com/office/word/2018/wordml/cex" xmlns:w16cid="http://schemas.microsoft.com/office/word/2016/wordml/cid" xmlns:w16="http://schemas.microsoft.com/office/word/2018/wordml" xmlns:w16du="http://schemas.microsoft.com/office/word/2023/wordml/word16du" xmlns:w16sdtdh="http://schemas.microsoft.com/office/word/2020/wordml/sdtdatahash" xmlns:w16sdtfl="http://schemas.microsoft.com/office/word/2024/wordml/sdtformatlock" xmlns:w16se="http://schemas.microsoft.com/office/word/2015/wordml/symex" xmlns:wpg="http://schemas.microsoft.com/office/word/2010/wordprocessingGroup" xmlns:wpi="http://schemas.microsoft.com/office/word/2010/wordprocessingInk" xmlns:wne="http://schemas.microsoft.com/office/word/2006/wordml" xmlns:wps="http://schemas.microsoft.com/office/word/2010/wordprocessingShape" mc:Ignorable="w14 w15 w16se w16cid w16 w16cex w16sdtdh w16sdtfl w16du wp14">
-  <w15:person w15:author="Testado">
-    <w15:presenceInfo w15:providerId="None" w15:userId="Testado"/>
+  <w15:person w15:author="Arcano">
+    <w15:presenceInfo w15:providerId="None" w15:userId="Arcano"/>
   </w15:person>
 </w15:people>
 </file>

</xml_diff>